<commit_message>
First sequence: Mme Tsogo's questions integrated and reworded (F4, F5, LSA, USA)
F4: physical question on destructive waves (cliff, stack, spit); F5:
fishing and mineral exploitation; LSA: economic activities,
non-renewable resources and agriculture in Cameroon; USA: agriculture,
renewable and non-renewable resources, pollution. Facilitators on one
line.

Co-Authored-By: Claude Opus 5.5 <noreply@anthropic.com>
Claude-Session: https://claude.ai/code/session_0115LFSb2ktGLWPeVksFkSer
</commit_message>
<xml_diff>
--- a/epreuves/2026-2027/Sequence_1/F1_Geography_Seq1_2026-2027.docx
+++ b/epreuves/2026-2027/Sequence_1/F1_Geography_Seq1_2026-2027.docx
@@ -2625,7 +2625,7 @@
     </w:p>
     <w:p>
       <w:pPr>
-        <w:spacing w:after="20" w:before="240"/>
+        <w:spacing w:after="0" w:before="160"/>
         <w:jc w:val="center"/>
       </w:pPr>
       <w:r>
@@ -2638,19 +2638,13 @@
         </w:rPr>
         <w:t xml:space="preserve">FACILITATOR:</w:t>
       </w:r>
-    </w:p>
-    <w:p>
-      <w:pPr>
-        <w:spacing w:after="0" w:before="0"/>
-        <w:jc w:val="center"/>
-      </w:pPr>
       <w:r>
         <w:rPr>
           <w:rFonts w:ascii="Times New Roman" w:cs="Times New Roman" w:eastAsia="Times New Roman" w:hAnsi="Times New Roman"/>
           <w:sz w:val="22"/>
           <w:szCs w:val="22"/>
         </w:rPr>
-        <w:t xml:space="preserve">Mme ASTHA Noura</w:t>
+        <w:t xml:space="preserve"> Mme ASTHA Noura</w:t>
       </w:r>
     </w:p>
     <w:sectPr>

</xml_diff>